<commit_message>
docs(pst): sincronizar informe final y presentación con el cierre real del sprint 4
- 108 pruebas de integración (se sumaron las 4 de los fixes de producción).
- Mención de la revisión multi-agente de preparación para producción y sus
  correcciones (anti doble-tap, transaccionalidad, ErrorBoundary, EAS, purga
  al cerrar sesión, traducción de errores).
</commit_message>
<xml_diff>
--- a/docs/pst/presentacion/trabajo4-informe-final.docx
+++ b/docs/pst/presentacion/trabajo4-informe-final.docx
@@ -316,7 +316,7 @@
           <w:b w:val="0"/>
           <w:sz w:val="24"/>
         </w:rPr>
-        <w:t>, garantizando que la atención clínica en campo nunca dependa de la red — incluidas las alarmas de medicación y el sistema de notificaciones, que operan sin conexión. La aplicación consume el API REST del CRM (157 rutas) mediante 10 servicios de dominio y expone 74 pantallas en los dominios público, dueño y administrador. El proceso se gestionó con Scrum en sprints de dos semanas, con desarrollo guiado por pruebas (TDD) y una regla estricta de trabajo sin datos simulados: 24 suites con 104 pruebas de integración se ejecutan contra el backend real. Los resultados demuestran el cumplimiento de los objetivos planificados con una velocity estable de 27 puntos por sprint, y el impacto se valida con la comunidad mediante el Formato de Evaluación de PST provisto por la universidad, aplicado a los usuarios finales.</w:t>
+        <w:t>, garantizando que la atención clínica en campo nunca dependa de la red — incluidas las alarmas de medicación y el sistema de notificaciones, que operan sin conexión. La aplicación consume el API REST del CRM (157 rutas) mediante 10 servicios de dominio y expone 74 pantallas en los dominios público, dueño y administrador. El proceso se gestionó con Scrum en sprints de dos semanas, con desarrollo guiado por pruebas (TDD) y una regla estricta de trabajo sin datos simulados: 24 suites con 108 pruebas de integración se ejecutan contra el backend real. Los resultados demuestran el cumplimiento de los objetivos planificados con una velocity estable de 27 puntos por sprint, y el impacto se valida con la comunidad mediante el Formato de Evaluación de PST provisto por la universidad, aplicado a los usuarios finales.</w:t>
       </w:r>
     </w:p>
     <w:p>
@@ -3543,7 +3543,23 @@
           <w:b w:val="0"/>
           <w:sz w:val="24"/>
         </w:rPr>
-        <w:t xml:space="preserve"> La verificación es una propiedad del proceso, no una etapa final: 24 suites con 104 casos de integración se ejecutan contra el backend real en cada compuerta de calidad; el hook pre-push bloquea la publicación de código defectuoso; el diagnóstico react-doctor cerró en cero hallazgos; y cada incremento se validó funcionalmente en emulador Android y con los informantes clave.</w:t>
+        <w:t xml:space="preserve"> La verificación es una propiedad del proceso, no una etapa final: 24 suites con 108 casos de integración se ejecutan contra el backend real en cada compuerta de calidad; el hook pre-push bloquea la publicación de código defectuoso; el diagnóstico react-doctor cerró en cero hallazgos; y cada incremento se validó funcionalmente en emulador Android y con los informantes clave. Como cierre del sprint 4 se ejecutó además una </w:t>
+      </w:r>
+      <w:r>
+        <w:rPr>
+          <w:rFonts w:ascii="Arial" w:hAnsi="Arial" w:cs="Arial"/>
+          <w:b/>
+          <w:sz w:val="24"/>
+        </w:rPr>
+        <w:t>revisión multi-agente de preparación para producción</w:t>
+      </w:r>
+      <w:r>
+        <w:rPr>
+          <w:rFonts w:ascii="Arial" w:hAnsi="Arial" w:cs="Arial"/>
+          <w:b w:val="0"/>
+          <w:sz w:val="24"/>
+        </w:rPr>
+        <w:t xml:space="preserve"> (cinco revisores independientes: seguridad, corrección, experiencia de usuario, configuración de release y rendimiento) cuyos hallazgos — bloqueantes e importantes — fueron corregidos en su totalidad: protección contra registros dobles de tomas, transaccionalidad de la base local, barrera de errores global, configuración de builds (EAS), purga de datos al cerrar sesión y traducción de errores del servidor, entre otros.</w:t>
       </w:r>
     </w:p>
     <w:p>
@@ -3803,7 +3819,7 @@
                 <w:b w:val="0"/>
                 <w:sz w:val="20"/>
               </w:rPr>
-              <w:t>24 / 104 — sin respuestas de API simuladas</w:t>
+              <w:t>24 / 108 — sin respuestas de API simuladas</w:t>
             </w:r>
           </w:p>
         </w:tc>
@@ -4374,7 +4390,7 @@
                 <w:b w:val="0"/>
                 <w:sz w:val="20"/>
               </w:rPr>
-              <w:t>24 suites / 104 pruebas contra el backend; hook pre-push; react-doctor en cero.</w:t>
+              <w:t>24 suites / 108 pruebas contra el backend; hook pre-push; react-doctor en cero.</w:t>
             </w:r>
           </w:p>
         </w:tc>
@@ -4678,7 +4694,7 @@
           <w:b w:val="0"/>
           <w:sz w:val="24"/>
         </w:rPr>
-        <w:t xml:space="preserve"> convirtió la calidad en una propiedad del proceso: 104 pruebas contra el backend real y cero hallazgos de diagnóstico al cierre, verificables por cualquier evaluador en el repositorio público.</w:t>
+        <w:t xml:space="preserve"> convirtió la calidad en una propiedad del proceso: 108 pruebas contra el backend real y cero hallazgos de diagnóstico al cierre, verificables por cualquier evaluador en el repositorio público.</w:t>
       </w:r>
     </w:p>
     <w:p>

</xml_diff>